<commit_message>
udpates from Arden doc, and bullet for US and canada
</commit_message>
<xml_diff>
--- a/src/assets/Registry-Application-Questions_Sept2026.docx
+++ b/src/assets/Registry-Application-Questions_Sept2026.docx
@@ -20,7 +20,7 @@
           <w:noProof/>
         </w:rPr>
         <w:drawing>
-          <wp:inline distT="0" distB="0" distL="0" distR="0" wp14:anchorId="76BDD528" wp14:editId="14A7BB22">
+          <wp:inline distT="0" distB="0" distL="0" distR="0" wp14:anchorId="76BDD528" wp14:editId="7860BF76">
             <wp:extent cx="2159000" cy="660400"/>
             <wp:effectExtent l="0" t="0" r="0" b="0"/>
             <wp:docPr id="1578819061" name="Picture 1" descr="A group of people in different colors&#10;&#10;AI-generated content may be incorrect."/>
@@ -68,6 +68,8 @@
           <w:rFonts w:asciiTheme="minorHAnsi" w:hAnsiTheme="minorHAnsi" w:cstheme="minorHAnsi"/>
           <w:b/>
           <w:bCs/>
+          <w:sz w:val="12"/>
+          <w:szCs w:val="12"/>
           <w:u w:val="single"/>
         </w:rPr>
       </w:pPr>
@@ -147,13 +149,29 @@
         <w:rPr>
           <w:rFonts w:asciiTheme="minorHAnsi" w:hAnsiTheme="minorHAnsi" w:cstheme="minorHAnsi"/>
         </w:rPr>
-        <w:t>The Registry is designed to connect climate adaptation service providers in the United States with communities who need support with adaptation.</w:t>
-      </w:r>
-      <w:r>
-        <w:rPr>
-          <w:rFonts w:asciiTheme="minorHAnsi" w:hAnsiTheme="minorHAnsi" w:cstheme="minorHAnsi"/>
-        </w:rPr>
-        <w:t>An adaptation service provider is an organization that focuses on helping communities prepare for the impacts of climate change</w:t>
+        <w:t xml:space="preserve">The Registry is designed to connect climate adaptation service providers in the United States with communities who need support with </w:t>
+      </w:r>
+      <w:proofErr w:type="spellStart"/>
+      <w:proofErr w:type="gramStart"/>
+      <w:r>
+        <w:rPr>
+          <w:rFonts w:asciiTheme="minorHAnsi" w:hAnsiTheme="minorHAnsi" w:cstheme="minorHAnsi"/>
+        </w:rPr>
+        <w:t>adaptation.</w:t>
+      </w:r>
+      <w:r>
+        <w:rPr>
+          <w:rFonts w:asciiTheme="minorHAnsi" w:hAnsiTheme="minorHAnsi" w:cstheme="minorHAnsi"/>
+        </w:rPr>
+        <w:t>An</w:t>
+      </w:r>
+      <w:proofErr w:type="spellEnd"/>
+      <w:proofErr w:type="gramEnd"/>
+      <w:r>
+        <w:rPr>
+          <w:rFonts w:asciiTheme="minorHAnsi" w:hAnsiTheme="minorHAnsi" w:cstheme="minorHAnsi"/>
+        </w:rPr>
+        <w:t xml:space="preserve"> adaptation service provider is an organization that focuses on helping communities prepare for the impacts of climate change</w:t>
       </w:r>
       <w:r>
         <w:rPr>
@@ -232,21 +250,21 @@
         <w:rPr>
           <w:rFonts w:asciiTheme="minorHAnsi" w:hAnsiTheme="minorHAnsi" w:cstheme="minorHAnsi"/>
         </w:rPr>
-        <w:t>, among others. Climate adaptation teams or divisions within a larger organization should apply on behalf of that specific team rather than for the organization as a whole. Similarly, a team based in a regional or state office within a larger organization should apply on behalf of the team in that location.</w:t>
-      </w:r>
-    </w:p>
-    <w:p>
-      <w:pPr>
-        <w:spacing w:after="160"/>
-        <w:rPr>
-          <w:rFonts w:asciiTheme="minorHAnsi" w:hAnsiTheme="minorHAnsi" w:cstheme="minorHAnsi"/>
-        </w:rPr>
-      </w:pPr>
-      <w:r>
-        <w:rPr>
-          <w:rFonts w:asciiTheme="minorHAnsi" w:hAnsiTheme="minorHAnsi" w:cstheme="minorHAnsi"/>
-        </w:rPr>
-        <w:t xml:space="preserve">While the Registry does accept applications from outside the United States, the Registry website does not currently support search results for organizations not in the U.S. </w:t>
+        <w:t xml:space="preserve">, among others. Climate adaptation teams or divisions within a larger organization should apply on behalf of that specific team rather than for the </w:t>
+      </w:r>
+      <w:proofErr w:type="gramStart"/>
+      <w:r>
+        <w:rPr>
+          <w:rFonts w:asciiTheme="minorHAnsi" w:hAnsiTheme="minorHAnsi" w:cstheme="minorHAnsi"/>
+        </w:rPr>
+        <w:t>organization as a whole</w:t>
+      </w:r>
+      <w:proofErr w:type="gramEnd"/>
+      <w:r>
+        <w:rPr>
+          <w:rFonts w:asciiTheme="minorHAnsi" w:hAnsiTheme="minorHAnsi" w:cstheme="minorHAnsi"/>
+        </w:rPr>
+        <w:t>. Similarly, a team based in a regional or state office within a larger organization should apply on behalf of the team in that location.</w:t>
       </w:r>
     </w:p>
     <w:p>
@@ -326,15 +344,33 @@
           <w:b/>
           <w:bCs/>
         </w:rPr>
-        <w:t xml:space="preserve"> Applications with detected use of AI will be automatically rejected.</w:t>
-      </w:r>
-      <w:r>
-        <w:rPr>
-          <w:rFonts w:asciiTheme="minorHAnsi" w:hAnsiTheme="minorHAnsi" w:cstheme="minorHAnsi"/>
-          <w:b/>
-          <w:bCs/>
-        </w:rPr>
-        <w:t>**</w:t>
+        <w:t xml:space="preserve"> Applications with detected use of AI will be automatically </w:t>
+      </w:r>
+      <w:proofErr w:type="gramStart"/>
+      <w:r>
+        <w:rPr>
+          <w:rFonts w:asciiTheme="minorHAnsi" w:hAnsiTheme="minorHAnsi" w:cstheme="minorHAnsi"/>
+          <w:b/>
+          <w:bCs/>
+        </w:rPr>
+        <w:t>rejected.</w:t>
+      </w:r>
+      <w:r>
+        <w:rPr>
+          <w:rFonts w:asciiTheme="minorHAnsi" w:hAnsiTheme="minorHAnsi" w:cstheme="minorHAnsi"/>
+          <w:b/>
+          <w:bCs/>
+        </w:rPr>
+        <w:t>*</w:t>
+      </w:r>
+      <w:proofErr w:type="gramEnd"/>
+      <w:r>
+        <w:rPr>
+          <w:rFonts w:asciiTheme="minorHAnsi" w:hAnsiTheme="minorHAnsi" w:cstheme="minorHAnsi"/>
+          <w:b/>
+          <w:bCs/>
+        </w:rPr>
+        <w:t>*</w:t>
       </w:r>
     </w:p>
     <w:p>
@@ -417,10 +453,49 @@
     </w:p>
     <w:p>
       <w:pPr>
-        <w:rPr>
-          <w:rFonts w:asciiTheme="minorHAnsi" w:hAnsiTheme="minorHAnsi" w:cstheme="minorHAnsi"/>
-        </w:rPr>
-      </w:pPr>
+        <w:spacing w:after="160"/>
+        <w:rPr>
+          <w:rFonts w:asciiTheme="minorHAnsi" w:hAnsiTheme="minorHAnsi" w:cstheme="minorHAnsi"/>
+          <w:b/>
+          <w:bCs/>
+        </w:rPr>
+      </w:pPr>
+    </w:p>
+    <w:p>
+      <w:pPr>
+        <w:spacing w:after="160"/>
+        <w:rPr>
+          <w:rFonts w:asciiTheme="minorHAnsi" w:hAnsiTheme="minorHAnsi" w:cstheme="minorHAnsi"/>
+          <w:b/>
+          <w:bCs/>
+        </w:rPr>
+      </w:pPr>
+      <w:r>
+        <w:rPr>
+          <w:rFonts w:asciiTheme="minorHAnsi" w:hAnsiTheme="minorHAnsi" w:cstheme="minorHAnsi"/>
+          <w:b/>
+          <w:bCs/>
+        </w:rPr>
+        <w:t>What country is your organization based in?</w:t>
+      </w:r>
+    </w:p>
+    <w:p>
+      <w:pPr>
+        <w:spacing w:after="160"/>
+        <w:rPr>
+          <w:rFonts w:asciiTheme="minorHAnsi" w:hAnsiTheme="minorHAnsi" w:cstheme="minorHAnsi"/>
+          <w:i/>
+          <w:iCs/>
+        </w:rPr>
+      </w:pPr>
+      <w:r>
+        <w:rPr>
+          <w:rFonts w:asciiTheme="minorHAnsi" w:hAnsiTheme="minorHAnsi" w:cstheme="minorHAnsi"/>
+          <w:i/>
+          <w:iCs/>
+        </w:rPr>
+        <w:t>Note that organizations based outside the U.S. are ineligible to join the Registry.</w:t>
+      </w:r>
       <w:r>
         <w:rPr>
           <w:rFonts w:asciiTheme="minorHAnsi" w:hAnsiTheme="minorHAnsi" w:cstheme="minorHAnsi"/>
@@ -778,21 +853,6 @@
         </w:rPr>
         <w:tab/>
         <w:t>Zip code:</w:t>
-      </w:r>
-    </w:p>
-    <w:p>
-      <w:pPr>
-        <w:spacing w:after="160"/>
-        <w:rPr>
-          <w:rFonts w:asciiTheme="minorHAnsi" w:hAnsiTheme="minorHAnsi" w:cstheme="minorHAnsi"/>
-        </w:rPr>
-      </w:pPr>
-      <w:r>
-        <w:rPr>
-          <w:rFonts w:asciiTheme="minorHAnsi" w:hAnsiTheme="minorHAnsi" w:cstheme="minorHAnsi"/>
-        </w:rPr>
-        <w:tab/>
-        <w:t>Country (if outside the U.S.):</w:t>
       </w:r>
     </w:p>
     <w:p>
@@ -2106,7 +2166,19 @@
         <w:rPr>
           <w:rFonts w:asciiTheme="minorHAnsi" w:hAnsiTheme="minorHAnsi" w:cstheme="minorHAnsi"/>
         </w:rPr>
-        <w:t>How many years has your organization been working in the field of climate adaptation and resilience?</w:t>
+        <w:t xml:space="preserve">How many years has your organization been </w:t>
+      </w:r>
+      <w:r>
+        <w:rPr>
+          <w:rFonts w:asciiTheme="minorHAnsi" w:hAnsiTheme="minorHAnsi" w:cstheme="minorHAnsi"/>
+        </w:rPr>
+        <w:t>providing adaptation services</w:t>
+      </w:r>
+      <w:r>
+        <w:rPr>
+          <w:rFonts w:asciiTheme="minorHAnsi" w:hAnsiTheme="minorHAnsi" w:cstheme="minorHAnsi"/>
+        </w:rPr>
+        <w:t>?</w:t>
       </w:r>
     </w:p>
     <w:p>
@@ -4937,46 +5009,6 @@
         </w:rPr>
         <w:t xml:space="preserve"> </w:t>
       </w:r>
-      <w:r>
-        <w:rPr>
-          <w:rFonts w:asciiTheme="minorHAnsi" w:hAnsiTheme="minorHAnsi" w:cstheme="minorHAnsi"/>
-          <w:b/>
-          <w:bCs/>
-        </w:rPr>
-        <w:br/>
-      </w:r>
-      <w:r>
-        <w:rPr>
-          <w:rFonts w:asciiTheme="minorHAnsi" w:hAnsiTheme="minorHAnsi" w:cstheme="minorHAnsi"/>
-          <w:i/>
-          <w:iCs/>
-          <w:sz w:val="20"/>
-          <w:szCs w:val="20"/>
-        </w:rPr>
-        <w:t xml:space="preserve">If you </w:t>
-      </w:r>
-      <w:r>
-        <w:rPr>
-          <w:rFonts w:asciiTheme="minorHAnsi" w:hAnsiTheme="minorHAnsi" w:cstheme="minorHAnsi"/>
-          <w:b/>
-          <w:bCs/>
-          <w:i/>
-          <w:iCs/>
-          <w:sz w:val="20"/>
-          <w:szCs w:val="20"/>
-        </w:rPr>
-        <w:t>only</w:t>
-      </w:r>
-      <w:r>
-        <w:rPr>
-          <w:rFonts w:asciiTheme="minorHAnsi" w:hAnsiTheme="minorHAnsi" w:cstheme="minorHAnsi"/>
-          <w:i/>
-          <w:iCs/>
-          <w:sz w:val="20"/>
-          <w:szCs w:val="20"/>
-        </w:rPr>
-        <w:t xml:space="preserve"> work outside the U.S., please scroll to the bottom of the list on the online form and enter the country where you work.</w:t>
-      </w:r>
     </w:p>
     <w:p>
       <w:pPr>
@@ -5871,7 +5903,21 @@
         <w:rPr>
           <w:rFonts w:asciiTheme="minorHAnsi" w:hAnsiTheme="minorHAnsi" w:cstheme="minorHAnsi"/>
         </w:rPr>
-        <w:t xml:space="preserve"> (e.g, </w:t>
+        <w:t xml:space="preserve"> (</w:t>
+      </w:r>
+      <w:proofErr w:type="spellStart"/>
+      <w:r>
+        <w:rPr>
+          <w:rFonts w:asciiTheme="minorHAnsi" w:hAnsiTheme="minorHAnsi" w:cstheme="minorHAnsi"/>
+        </w:rPr>
+        <w:t>e.g</w:t>
+      </w:r>
+      <w:proofErr w:type="spellEnd"/>
+      <w:r>
+        <w:rPr>
+          <w:rFonts w:asciiTheme="minorHAnsi" w:hAnsiTheme="minorHAnsi" w:cstheme="minorHAnsi"/>
+        </w:rPr>
+        <w:t xml:space="preserve">, </w:t>
       </w:r>
       <w:r>
         <w:rPr>
@@ -7237,7 +7283,25 @@
           <w:b/>
           <w:bCs/>
         </w:rPr>
-        <w:t>**Do not use AI to draft your answers! This does not allow us to assess your expertise. If we suspect AI use (i.e., if the tone/content does not match the rest of your application), we will reject your application and ask you to reapply.**</w:t>
+        <w:t xml:space="preserve">**Do not use AI to draft your answers! This does not allow us to assess your expertise. If we suspect AI use (i.e., if the tone/content does not match the rest of your application), we will reject your application and ask you to </w:t>
+      </w:r>
+      <w:proofErr w:type="gramStart"/>
+      <w:r>
+        <w:rPr>
+          <w:rFonts w:asciiTheme="minorHAnsi" w:hAnsiTheme="minorHAnsi" w:cstheme="minorHAnsi"/>
+          <w:b/>
+          <w:bCs/>
+        </w:rPr>
+        <w:t>reapply.*</w:t>
+      </w:r>
+      <w:proofErr w:type="gramEnd"/>
+      <w:r>
+        <w:rPr>
+          <w:rFonts w:asciiTheme="minorHAnsi" w:hAnsiTheme="minorHAnsi" w:cstheme="minorHAnsi"/>
+          <w:b/>
+          <w:bCs/>
+        </w:rPr>
+        <w:t>*</w:t>
       </w:r>
     </w:p>
     <w:p>
@@ -7625,7 +7689,21 @@
         <w:rPr>
           <w:rFonts w:asciiTheme="minorHAnsi" w:hAnsiTheme="minorHAnsi" w:cstheme="minorHAnsi"/>
         </w:rPr>
-        <w:t>. The categories exist only to improve the user experience on the Registry, no benefits or drawbacks are associated with being in one or the other.</w:t>
+        <w:t xml:space="preserve">. The categories exist only to improve the user experience on the </w:t>
+      </w:r>
+      <w:proofErr w:type="gramStart"/>
+      <w:r>
+        <w:rPr>
+          <w:rFonts w:asciiTheme="minorHAnsi" w:hAnsiTheme="minorHAnsi" w:cstheme="minorHAnsi"/>
+        </w:rPr>
+        <w:t>Registry,</w:t>
+      </w:r>
+      <w:proofErr w:type="gramEnd"/>
+      <w:r>
+        <w:rPr>
+          <w:rFonts w:asciiTheme="minorHAnsi" w:hAnsiTheme="minorHAnsi" w:cstheme="minorHAnsi"/>
+        </w:rPr>
+        <w:t xml:space="preserve"> no benefits or drawbacks are associated with being in one or the other.</w:t>
       </w:r>
     </w:p>
     <w:p>

</xml_diff>